<commit_message>
slight amendments to text
</commit_message>
<xml_diff>
--- a/downloads/BeezKnees_Bee_Health_Checker_UK.docx
+++ b/downloads/BeezKnees_Bee_Health_Checker_UK.docx
@@ -536,14 +536,13 @@
           </w:tcPr>
           <w:p>
             <w:pPr>
-              <w:jc w:val="center"/>
               <w:rPr>
-                <w:b/>
+                <w:bCs/>
               </w:rPr>
             </w:pPr>
             <w:r>
               <w:rPr>
-                <w:b/>
+                <w:bCs/>
               </w:rPr>
               <w:t>Hard, dark, stone-like mummified brood</w:t>
             </w:r>
@@ -555,16 +554,29 @@
           </w:tcPr>
           <w:p>
             <w:pPr>
-              <w:jc w:val="center"/>
               <w:rPr>
-                <w:b/>
+                <w:bCs/>
               </w:rPr>
             </w:pPr>
             <w:r>
               <w:rPr>
-                <w:b/>
+                <w:bCs/>
               </w:rPr>
-              <w:t>Check damp conditions and hygiene; confirm it is brood not debris</w:t>
+              <w:t xml:space="preserve">Check damp conditions and hygiene; confirm it is </w:t>
+            </w:r>
+            <w:proofErr w:type="gramStart"/>
+            <w:r>
+              <w:rPr>
+                <w:bCs/>
+              </w:rPr>
+              <w:t>brood</w:t>
+            </w:r>
+            <w:proofErr w:type="gramEnd"/>
+            <w:r>
+              <w:rPr>
+                <w:bCs/>
+              </w:rPr>
+              <w:t xml:space="preserve"> not debris</w:t>
             </w:r>
           </w:p>
         </w:tc>
@@ -574,14 +586,13 @@
           </w:tcPr>
           <w:p>
             <w:pPr>
-              <w:jc w:val="center"/>
               <w:rPr>
-                <w:b/>
+                <w:bCs/>
               </w:rPr>
             </w:pPr>
             <w:r>
               <w:rPr>
-                <w:b/>
+                <w:bCs/>
               </w:rPr>
               <w:t>Stonebrood (Aspergillus spp.)</w:t>
             </w:r>
@@ -593,14 +604,13 @@
           </w:tcPr>
           <w:p>
             <w:pPr>
-              <w:jc w:val="center"/>
               <w:rPr>
-                <w:b/>
+                <w:bCs/>
               </w:rPr>
             </w:pPr>
             <w:r>
               <w:rPr>
-                <w:b/>
+                <w:bCs/>
               </w:rPr>
               <w:t>Act soon</w:t>
             </w:r>
@@ -612,16 +622,51 @@
           </w:tcPr>
           <w:p>
             <w:pPr>
-              <w:jc w:val="center"/>
               <w:rPr>
-                <w:b/>
+                <w:bCs/>
               </w:rPr>
             </w:pPr>
+            <w:proofErr w:type="gramStart"/>
             <w:r>
               <w:rPr>
-                <w:b/>
+                <w:bCs/>
               </w:rPr>
-              <w:t>Remove affected material where practical. Improve hive conditions (dry, well-sited).</w:t>
+              <w:t>Remove</w:t>
+            </w:r>
+            <w:proofErr w:type="gramEnd"/>
+            <w:r>
+              <w:rPr>
+                <w:bCs/>
+              </w:rPr>
+              <w:t xml:space="preserve"> affected </w:t>
+            </w:r>
+            <w:proofErr w:type="gramStart"/>
+            <w:r>
+              <w:rPr>
+                <w:bCs/>
+              </w:rPr>
+              <w:t>material</w:t>
+            </w:r>
+            <w:proofErr w:type="gramEnd"/>
+            <w:r>
+              <w:rPr>
+                <w:bCs/>
+              </w:rPr>
+              <w:t xml:space="preserve"> </w:t>
+            </w:r>
+            <w:proofErr w:type="gramStart"/>
+            <w:r>
+              <w:rPr>
+                <w:bCs/>
+              </w:rPr>
+              <w:t>where</w:t>
+            </w:r>
+            <w:proofErr w:type="gramEnd"/>
+            <w:r>
+              <w:rPr>
+                <w:bCs/>
+              </w:rPr>
+              <w:t xml:space="preserve"> practical. Improve hive conditions (dry, well-sited).</w:t>
             </w:r>
           </w:p>
         </w:tc>

</xml_diff>